<commit_message>
update config-driven system architect & Data Ingestion Pipeline
</commit_message>
<xml_diff>
--- a/DEVOPS_RUNBOOK.docx
+++ b/DEVOPS_RUNBOOK.docx
@@ -4283,6 +4283,50 @@
     <w:p>
       <w:pPr>
         <w:keepNext/>
+        <w:spacing w:before="200" w:after="80"/>
+      </w:pPr>
+      <w:r>
+        <w:rPr>
+          <w:rFonts w:ascii="Arial" w:hAnsi="Arial"/>
+          <w:b/>
+          <w:color w:val="1A365D"/>
+          <w:sz w:val="22"/>
+        </w:rPr>
+        <w:t>SOP-06: Quy trình Onboarding Khách Hàng Mới &amp; Nạp Knowledge Base</w:t>
+      </w:r>
+    </w:p>
+    <w:p>
+      <w:pPr>
+        <w:spacing w:before="0" w:after="120" w:line="276" w:lineRule="auto"/>
+      </w:pPr>
+      <w:r>
+        <w:rPr>
+          <w:rFonts w:ascii="Arial" w:hAnsi="Arial"/>
+          <w:color w:val="2D3748"/>
+          <w:sz w:val="20"/>
+        </w:rPr>
+        <w:t>Quy trình 5 bước nạp tài liệu và cấu hình hệ thống nghiệp vụ cho khách hàng doanh nghiệp mới mà không cần sửa code:</w:t>
+        <w:br/>
+        <w:t>1. Khai báo hệ thống nghiệp vụ trong `config/systems.yaml` (ví dụ: ERP, HRM, CRM, CORE_BANKING) và các vai trò quản trị tương ứng.</w:t>
+        <w:br/>
+        <w:t>2. Đặt tài liệu kỹ thuật/SOP (.md, .txt, .docx, .jsonl) vào thư mục `data/knowledge_base/`.</w:t>
+        <w:br/>
+        <w:t>3. Chạy kiểm thử mô phỏng (Dry-Run) để xác thực định dạng và phân tách đoạn (semantic chunking):</w:t>
+        <w:br/>
+        <w:t xml:space="preserve">   `make ingest-kb-dry`</w:t>
+        <w:br/>
+        <w:t>4. Thực hiện nạp chính thức dữ liệu và sinh vector embedding 768-dim (text-embedding-005) vào BigQuery:</w:t>
+        <w:br/>
+        <w:t xml:space="preserve">   `make ingest-kb`</w:t>
+        <w:br/>
+        <w:t>5. Xác minh truy vấn ngữ nghĩa với cờ `--test-query`:</w:t>
+        <w:br/>
+        <w:t xml:space="preserve">   `python scripts/ingest_knowledge_base.py --test-query "lỗi phân quyền SAP PO"`</w:t>
+      </w:r>
+    </w:p>
+    <w:p>
+      <w:pPr>
+        <w:keepNext/>
         <w:spacing w:before="360" w:after="160"/>
       </w:pPr>
       <w:r>

</xml_diff>